<commit_message>
Updated template to handle more headings, such as the name of the record (i.e. Old Testament) and all its books.
</commit_message>
<xml_diff>
--- a/templates/default.docx
+++ b/templates/default.docx
@@ -15,7 +15,15 @@
         <w:pStyle w:val="Heading1"/>
       </w:pPr>
       <w:r>
-        <w:t>First book</w:t>
+        <w:t>The Book of Mormon</w:t>
+      </w:r>
+    </w:p>
+    <w:p>
+      <w:pPr>
+        <w:pStyle w:val="Heading2"/>
+      </w:pPr>
+      <w:r>
+        <w:t>First Book</w:t>
       </w:r>
     </w:p>
     <w:p>
@@ -91,7 +99,7 @@
   <w:latentStyles w:defLockedState="0" w:defUIPriority="99" w:defSemiHidden="0" w:defUnhideWhenUsed="0" w:defQFormat="0" w:count="376">
     <w:lsdException w:name="Normal" w:uiPriority="0" w:qFormat="1"/>
     <w:lsdException w:name="heading 1" w:uiPriority="9" w:qFormat="1"/>
-    <w:lsdException w:name="heading 2" w:semiHidden="1" w:uiPriority="9" w:unhideWhenUsed="1"/>
+    <w:lsdException w:name="heading 2" w:semiHidden="1" w:uiPriority="9" w:unhideWhenUsed="1" w:qFormat="1"/>
     <w:lsdException w:name="heading 3" w:semiHidden="1" w:uiPriority="9" w:unhideWhenUsed="1" w:qFormat="1"/>
     <w:lsdException w:name="heading 4" w:semiHidden="1" w:uiPriority="9" w:unhideWhenUsed="1"/>
     <w:lsdException w:name="heading 5" w:semiHidden="1" w:uiPriority="9" w:unhideWhenUsed="1"/>
@@ -511,17 +519,18 @@
     <w:next w:val="Normal"/>
     <w:link w:val="Heading2Char"/>
     <w:uiPriority w:val="9"/>
-    <w:semiHidden/>
     <w:unhideWhenUsed/>
-    <w:rsid w:val="0001668A"/>
+    <w:qFormat/>
+    <w:rsid w:val="000F2963"/>
     <w:pPr>
       <w:keepNext/>
       <w:keepLines/>
       <w:spacing w:before="160" w:after="80"/>
+      <w:ind w:firstLine="0"/>
       <w:outlineLvl w:val="1"/>
     </w:pPr>
     <w:rPr>
-      <w:rFonts w:asciiTheme="majorHAnsi" w:eastAsiaTheme="majorEastAsia" w:hAnsiTheme="majorHAnsi"/>
+      <w:rFonts w:asciiTheme="majorBidi" w:eastAsiaTheme="majorEastAsia" w:hAnsiTheme="majorBidi"/>
       <w:color w:val="0F4761" w:themeColor="accent1" w:themeShade="BF"/>
       <w:sz w:val="32"/>
       <w:szCs w:val="32"/>
@@ -725,10 +734,9 @@
     <w:basedOn w:val="DefaultParagraphFont"/>
     <w:link w:val="Heading2"/>
     <w:uiPriority w:val="9"/>
-    <w:semiHidden/>
-    <w:rsid w:val="0001668A"/>
-    <w:rPr>
-      <w:rFonts w:asciiTheme="majorHAnsi" w:eastAsiaTheme="majorEastAsia" w:hAnsiTheme="majorHAnsi" w:cstheme="majorBidi"/>
+    <w:rsid w:val="000F2963"/>
+    <w:rPr>
+      <w:rFonts w:asciiTheme="majorBidi" w:eastAsiaTheme="majorEastAsia" w:hAnsiTheme="majorBidi" w:cstheme="majorBidi"/>
       <w:color w:val="0F4761" w:themeColor="accent1" w:themeShade="BF"/>
       <w:kern w:val="0"/>
       <w:sz w:val="32"/>

</xml_diff>